<commit_message>
Updated prod file for testing
</commit_message>
<xml_diff>
--- a/product-definitions/foundations-input/Neo-CRM-initial.docx
+++ b/product-definitions/foundations-input/Neo-CRM-initial.docx
@@ -26,17 +26,7 @@
           <w:sz w:val="26"/>
           <w:szCs w:val="26"/>
         </w:rPr>
-        <w:t>Product brief (draft) – conversational CRM idea</w:t>
-      </w:r>
-      <w:r>
-        <w:rPr>
-          <w:b/>
-          <w:bCs/>
-          <w:color w:val="000000"/>
-          <w:sz w:val="26"/>
-          <w:szCs w:val="26"/>
-        </w:rPr>
-        <w:t>s</w:t>
+        <w:t>Product brief (draft) – conversational CRM ideas</w:t>
       </w:r>
     </w:p>
     <w:p>
@@ -47,7 +37,15 @@
       </w:pPr>
       <w:r>
         <w:rPr/>
-        <w:t>So basically the thinking here is that CRM as it exists today (like Salesforce etc.) is kind of broken for most people actually doing the work. It’s too much clicking around, updating fields, checking dashboards… feels like admin work instead of helping you sell.</w:t>
+        <w:t xml:space="preserve">So basically the thinking here is that CRM as it exists today (like Salesforce </w:t>
+      </w:r>
+      <w:r>
+        <w:rPr/>
+        <w:t>and others</w:t>
+      </w:r>
+      <w:r>
+        <w:rPr/>
+        <w:t>.) is kind of broken for most people actually doing the work. It’s too much clicking around, updating fields, checking dashboards… feels like admin work instead of helping you sell.</w:t>
       </w:r>
     </w:p>
     <w:p>
@@ -85,15 +83,11 @@
               <wp:inline distT="0" distB="0" distL="0" distR="0">
                 <wp:extent cx="5943600" cy="19050"/>
                 <wp:effectExtent l="0" t="0" r="0" b="0"/>
-                <wp:docPr id="1" name=""/>
+                <wp:docPr id="1" name="Shape1"/>
                 <a:graphic xmlns:a="http://schemas.openxmlformats.org/drawingml/2006/main">
                   <a:graphicData uri="http://schemas.microsoft.com/office/word/2010/wordprocessingShape">
                     <wps:wsp>
                       <wps:cNvSpPr/>
-                      <wps:nvSpPr>
-                        <wps:cNvPr id="2" name=""/>
-                        <wps:cNvSpPr/>
-                      </wps:nvSpPr>
                       <wps:spPr>
                         <a:xfrm>
                           <a:off x="0" y="0"/>
@@ -109,6 +103,12 @@
                           <a:noFill/>
                         </a:ln>
                       </wps:spPr>
+                      <wps:style>
+                        <a:lnRef idx="0"/>
+                        <a:fillRef idx="0"/>
+                        <a:effectRef idx="0"/>
+                        <a:fontRef idx="minor"/>
+                      </wps:style>
                       <wps:bodyPr/>
                     </wps:wsp>
                   </a:graphicData>
@@ -121,10 +121,10 @@
           </mc:Choice>
           <mc:Fallback>
             <w:pict>
-              <v:rect id="shape_0" fillcolor="#a0a0a0" stroked="f" o:allowincell="f" style="position:absolute;margin-left:0pt;margin-top:-1.55pt;width:467.95pt;height:1.45pt;mso-wrap-style:none;v-text-anchor:middle;mso-position-horizontal:center;mso-position-vertical:top">
+              <v:rect id="shape_0" fillcolor="#a0a0a0" stroked="f" o:allowincell="f" style="position:absolute;margin-left:0pt;margin-top:-1.55pt;width:467.95pt;height:1.45pt;mso-wrap-style:none;v-text-anchor:middle;mso-position-vertical:top">
                 <v:fill o:detectmouseclick="t" type="solid" color2="#5f5f5f"/>
                 <v:stroke color="#3465a4" joinstyle="round" endcap="flat"/>
-                <w10:wrap type="topAndBottom"/>
+                <w10:wrap type="square"/>
               </v:rect>
             </w:pict>
           </mc:Fallback>
@@ -268,15 +268,11 @@
               <wp:inline distT="0" distB="0" distL="0" distR="0">
                 <wp:extent cx="5943600" cy="19050"/>
                 <wp:effectExtent l="0" t="0" r="0" b="0"/>
-                <wp:docPr id="3" name=""/>
+                <wp:docPr id="2" name="Shape2"/>
                 <a:graphic xmlns:a="http://schemas.openxmlformats.org/drawingml/2006/main">
                   <a:graphicData uri="http://schemas.microsoft.com/office/word/2010/wordprocessingShape">
                     <wps:wsp>
                       <wps:cNvSpPr/>
-                      <wps:nvSpPr>
-                        <wps:cNvPr id="4" name=""/>
-                        <wps:cNvSpPr/>
-                      </wps:nvSpPr>
                       <wps:spPr>
                         <a:xfrm>
                           <a:off x="0" y="0"/>
@@ -292,6 +288,12 @@
                           <a:noFill/>
                         </a:ln>
                       </wps:spPr>
+                      <wps:style>
+                        <a:lnRef idx="0"/>
+                        <a:fillRef idx="0"/>
+                        <a:effectRef idx="0"/>
+                        <a:fontRef idx="minor"/>
+                      </wps:style>
                       <wps:bodyPr/>
                     </wps:wsp>
                   </a:graphicData>
@@ -304,10 +306,10 @@
           </mc:Choice>
           <mc:Fallback>
             <w:pict>
-              <v:rect id="shape_0" fillcolor="#a0a0a0" stroked="f" o:allowincell="f" style="position:absolute;margin-left:0pt;margin-top:-1.55pt;width:467.95pt;height:1.45pt;mso-wrap-style:none;v-text-anchor:middle;mso-position-horizontal:center;mso-position-vertical:top">
+              <v:rect id="shape_0" fillcolor="#a0a0a0" stroked="f" o:allowincell="f" style="position:absolute;margin-left:0pt;margin-top:-1.55pt;width:467.95pt;height:1.45pt;mso-wrap-style:none;v-text-anchor:middle;mso-position-vertical:top">
                 <v:fill o:detectmouseclick="t" type="solid" color2="#5f5f5f"/>
                 <v:stroke color="#3465a4" joinstyle="round" endcap="flat"/>
-                <w10:wrap type="topAndBottom"/>
+                <w10:wrap type="square"/>
               </v:rect>
             </w:pict>
           </mc:Fallback>
@@ -435,15 +437,11 @@
               <wp:inline distT="0" distB="0" distL="0" distR="0">
                 <wp:extent cx="5943600" cy="19050"/>
                 <wp:effectExtent l="0" t="0" r="0" b="0"/>
-                <wp:docPr id="5" name=""/>
+                <wp:docPr id="3" name="Shape3"/>
                 <a:graphic xmlns:a="http://schemas.openxmlformats.org/drawingml/2006/main">
                   <a:graphicData uri="http://schemas.microsoft.com/office/word/2010/wordprocessingShape">
                     <wps:wsp>
                       <wps:cNvSpPr/>
-                      <wps:nvSpPr>
-                        <wps:cNvPr id="6" name=""/>
-                        <wps:cNvSpPr/>
-                      </wps:nvSpPr>
                       <wps:spPr>
                         <a:xfrm>
                           <a:off x="0" y="0"/>
@@ -459,6 +457,12 @@
                           <a:noFill/>
                         </a:ln>
                       </wps:spPr>
+                      <wps:style>
+                        <a:lnRef idx="0"/>
+                        <a:fillRef idx="0"/>
+                        <a:effectRef idx="0"/>
+                        <a:fontRef idx="minor"/>
+                      </wps:style>
                       <wps:bodyPr/>
                     </wps:wsp>
                   </a:graphicData>
@@ -471,10 +475,10 @@
           </mc:Choice>
           <mc:Fallback>
             <w:pict>
-              <v:rect id="shape_0" fillcolor="#a0a0a0" stroked="f" o:allowincell="f" style="position:absolute;margin-left:0pt;margin-top:-1.55pt;width:467.95pt;height:1.45pt;mso-wrap-style:none;v-text-anchor:middle;mso-position-horizontal:center;mso-position-vertical:top">
+              <v:rect id="shape_0" fillcolor="#a0a0a0" stroked="f" o:allowincell="f" style="position:absolute;margin-left:0pt;margin-top:-1.55pt;width:467.95pt;height:1.45pt;mso-wrap-style:none;v-text-anchor:middle;mso-position-vertical:top">
                 <v:fill o:detectmouseclick="t" type="solid" color2="#5f5f5f"/>
                 <v:stroke color="#3465a4" joinstyle="round" endcap="flat"/>
-                <w10:wrap type="topAndBottom"/>
+                <w10:wrap type="square"/>
               </v:rect>
             </w:pict>
           </mc:Fallback>
@@ -607,15 +611,11 @@
               <wp:inline distT="0" distB="0" distL="0" distR="0">
                 <wp:extent cx="5943600" cy="19050"/>
                 <wp:effectExtent l="0" t="0" r="0" b="0"/>
-                <wp:docPr id="7" name=""/>
+                <wp:docPr id="4" name="Shape4"/>
                 <a:graphic xmlns:a="http://schemas.openxmlformats.org/drawingml/2006/main">
                   <a:graphicData uri="http://schemas.microsoft.com/office/word/2010/wordprocessingShape">
                     <wps:wsp>
                       <wps:cNvSpPr/>
-                      <wps:nvSpPr>
-                        <wps:cNvPr id="8" name=""/>
-                        <wps:cNvSpPr/>
-                      </wps:nvSpPr>
                       <wps:spPr>
                         <a:xfrm>
                           <a:off x="0" y="0"/>
@@ -631,6 +631,12 @@
                           <a:noFill/>
                         </a:ln>
                       </wps:spPr>
+                      <wps:style>
+                        <a:lnRef idx="0"/>
+                        <a:fillRef idx="0"/>
+                        <a:effectRef idx="0"/>
+                        <a:fontRef idx="minor"/>
+                      </wps:style>
                       <wps:bodyPr/>
                     </wps:wsp>
                   </a:graphicData>
@@ -643,10 +649,10 @@
           </mc:Choice>
           <mc:Fallback>
             <w:pict>
-              <v:rect id="shape_0" fillcolor="#a0a0a0" stroked="f" o:allowincell="f" style="position:absolute;margin-left:0pt;margin-top:-1.55pt;width:467.95pt;height:1.45pt;mso-wrap-style:none;v-text-anchor:middle;mso-position-horizontal:center;mso-position-vertical:top">
+              <v:rect id="shape_0" fillcolor="#a0a0a0" stroked="f" o:allowincell="f" style="position:absolute;margin-left:0pt;margin-top:-1.55pt;width:467.95pt;height:1.45pt;mso-wrap-style:none;v-text-anchor:middle;mso-position-vertical:top">
                 <v:fill o:detectmouseclick="t" type="solid" color2="#5f5f5f"/>
                 <v:stroke color="#3465a4" joinstyle="round" endcap="flat"/>
-                <w10:wrap type="topAndBottom"/>
+                <w10:wrap type="square"/>
               </v:rect>
             </w:pict>
           </mc:Fallback>
@@ -811,15 +817,11 @@
               <wp:inline distT="0" distB="0" distL="0" distR="0">
                 <wp:extent cx="5943600" cy="19050"/>
                 <wp:effectExtent l="0" t="0" r="0" b="0"/>
-                <wp:docPr id="9" name=""/>
+                <wp:docPr id="5" name="Shape5"/>
                 <a:graphic xmlns:a="http://schemas.openxmlformats.org/drawingml/2006/main">
                   <a:graphicData uri="http://schemas.microsoft.com/office/word/2010/wordprocessingShape">
                     <wps:wsp>
                       <wps:cNvSpPr/>
-                      <wps:nvSpPr>
-                        <wps:cNvPr id="10" name=""/>
-                        <wps:cNvSpPr/>
-                      </wps:nvSpPr>
                       <wps:spPr>
                         <a:xfrm>
                           <a:off x="0" y="0"/>
@@ -835,6 +837,12 @@
                           <a:noFill/>
                         </a:ln>
                       </wps:spPr>
+                      <wps:style>
+                        <a:lnRef idx="0"/>
+                        <a:fillRef idx="0"/>
+                        <a:effectRef idx="0"/>
+                        <a:fontRef idx="minor"/>
+                      </wps:style>
                       <wps:bodyPr/>
                     </wps:wsp>
                   </a:graphicData>
@@ -847,10 +855,10 @@
           </mc:Choice>
           <mc:Fallback>
             <w:pict>
-              <v:rect id="shape_0" fillcolor="#a0a0a0" stroked="f" o:allowincell="f" style="position:absolute;margin-left:0pt;margin-top:-1.55pt;width:467.95pt;height:1.45pt;mso-wrap-style:none;v-text-anchor:middle;mso-position-horizontal:center;mso-position-vertical:top">
+              <v:rect id="shape_0" fillcolor="#a0a0a0" stroked="f" o:allowincell="f" style="position:absolute;margin-left:0pt;margin-top:-1.55pt;width:467.95pt;height:1.45pt;mso-wrap-style:none;v-text-anchor:middle;mso-position-vertical:top">
                 <v:fill o:detectmouseclick="t" type="solid" color2="#5f5f5f"/>
                 <v:stroke color="#3465a4" joinstyle="round" endcap="flat"/>
-                <w10:wrap type="topAndBottom"/>
+                <w10:wrap type="square"/>
               </v:rect>
             </w:pict>
           </mc:Fallback>
@@ -994,15 +1002,11 @@
               <wp:inline distT="0" distB="0" distL="0" distR="0">
                 <wp:extent cx="5943600" cy="19050"/>
                 <wp:effectExtent l="0" t="0" r="0" b="0"/>
-                <wp:docPr id="11" name=""/>
+                <wp:docPr id="6" name="Shape6"/>
                 <a:graphic xmlns:a="http://schemas.openxmlformats.org/drawingml/2006/main">
                   <a:graphicData uri="http://schemas.microsoft.com/office/word/2010/wordprocessingShape">
                     <wps:wsp>
                       <wps:cNvSpPr/>
-                      <wps:nvSpPr>
-                        <wps:cNvPr id="12" name=""/>
-                        <wps:cNvSpPr/>
-                      </wps:nvSpPr>
                       <wps:spPr>
                         <a:xfrm>
                           <a:off x="0" y="0"/>
@@ -1018,6 +1022,12 @@
                           <a:noFill/>
                         </a:ln>
                       </wps:spPr>
+                      <wps:style>
+                        <a:lnRef idx="0"/>
+                        <a:fillRef idx="0"/>
+                        <a:effectRef idx="0"/>
+                        <a:fontRef idx="minor"/>
+                      </wps:style>
                       <wps:bodyPr/>
                     </wps:wsp>
                   </a:graphicData>
@@ -1030,10 +1040,10 @@
           </mc:Choice>
           <mc:Fallback>
             <w:pict>
-              <v:rect id="shape_0" fillcolor="#a0a0a0" stroked="f" o:allowincell="f" style="position:absolute;margin-left:0pt;margin-top:-1.55pt;width:467.95pt;height:1.45pt;mso-wrap-style:none;v-text-anchor:middle;mso-position-horizontal:center;mso-position-vertical:top">
+              <v:rect id="shape_0" fillcolor="#a0a0a0" stroked="f" o:allowincell="f" style="position:absolute;margin-left:0pt;margin-top:-1.55pt;width:467.95pt;height:1.45pt;mso-wrap-style:none;v-text-anchor:middle;mso-position-vertical:top">
                 <v:fill o:detectmouseclick="t" type="solid" color2="#5f5f5f"/>
                 <v:stroke color="#3465a4" joinstyle="round" endcap="flat"/>
-                <w10:wrap type="topAndBottom"/>
+                <w10:wrap type="square"/>
               </v:rect>
             </w:pict>
           </mc:Fallback>
@@ -1169,15 +1179,11 @@
               <wp:inline distT="0" distB="0" distL="0" distR="0">
                 <wp:extent cx="5943600" cy="19050"/>
                 <wp:effectExtent l="0" t="0" r="0" b="0"/>
-                <wp:docPr id="13" name=""/>
+                <wp:docPr id="7" name="Shape7"/>
                 <a:graphic xmlns:a="http://schemas.openxmlformats.org/drawingml/2006/main">
                   <a:graphicData uri="http://schemas.microsoft.com/office/word/2010/wordprocessingShape">
                     <wps:wsp>
                       <wps:cNvSpPr/>
-                      <wps:nvSpPr>
-                        <wps:cNvPr id="14" name=""/>
-                        <wps:cNvSpPr/>
-                      </wps:nvSpPr>
                       <wps:spPr>
                         <a:xfrm>
                           <a:off x="0" y="0"/>
@@ -1193,6 +1199,12 @@
                           <a:noFill/>
                         </a:ln>
                       </wps:spPr>
+                      <wps:style>
+                        <a:lnRef idx="0"/>
+                        <a:fillRef idx="0"/>
+                        <a:effectRef idx="0"/>
+                        <a:fontRef idx="minor"/>
+                      </wps:style>
                       <wps:bodyPr/>
                     </wps:wsp>
                   </a:graphicData>
@@ -1205,10 +1217,10 @@
           </mc:Choice>
           <mc:Fallback>
             <w:pict>
-              <v:rect id="shape_0" fillcolor="#a0a0a0" stroked="f" o:allowincell="f" style="position:absolute;margin-left:0pt;margin-top:-1.55pt;width:467.95pt;height:1.45pt;mso-wrap-style:none;v-text-anchor:middle;mso-position-horizontal:center;mso-position-vertical:top">
+              <v:rect id="shape_0" fillcolor="#a0a0a0" stroked="f" o:allowincell="f" style="position:absolute;margin-left:0pt;margin-top:-1.55pt;width:467.95pt;height:1.45pt;mso-wrap-style:none;v-text-anchor:middle;mso-position-vertical:top">
                 <v:fill o:detectmouseclick="t" type="solid" color2="#5f5f5f"/>
                 <v:stroke color="#3465a4" joinstyle="round" endcap="flat"/>
-                <w10:wrap type="topAndBottom"/>
+                <w10:wrap type="square"/>
               </v:rect>
             </w:pict>
           </mc:Fallback>
@@ -2329,6 +2341,7 @@
     <w:qFormat/>
     <w:pPr>
       <w:widowControl/>
+      <w:suppressAutoHyphens w:val="true"/>
       <w:bidi w:val="0"/>
       <w:spacing w:lineRule="auto" w:line="276" w:before="0" w:after="0"/>
       <w:jc w:val="start"/>
@@ -2511,6 +2524,7 @@
     <w:qFormat/>
     <w:pPr>
       <w:widowControl/>
+      <w:suppressAutoHyphens w:val="true"/>
       <w:bidi w:val="0"/>
       <w:spacing w:lineRule="auto" w:line="276" w:before="0" w:after="0"/>
       <w:jc w:val="start"/>

</xml_diff>

<commit_message>
Added logo copy to _site
</commit_message>
<xml_diff>
--- a/product-definitions/foundations-input/Neo-CRM-initial.docx
+++ b/product-definitions/foundations-input/Neo-CRM-initial.docx
@@ -26,17 +26,7 @@
           <w:sz w:val="26"/>
           <w:szCs w:val="26"/>
         </w:rPr>
-        <w:t>Product brief (draft) – conversational CRM idea</w:t>
-      </w:r>
-      <w:r>
-        <w:rPr>
-          <w:b/>
-          <w:bCs/>
-          <w:color w:val="000000"/>
-          <w:sz w:val="26"/>
-          <w:szCs w:val="26"/>
-        </w:rPr>
-        <w:t>s</w:t>
+        <w:t>Product brief (draft) – conversational CRM ideas.</w:t>
       </w:r>
     </w:p>
     <w:p>
@@ -85,15 +75,11 @@
               <wp:inline distT="0" distB="0" distL="0" distR="0">
                 <wp:extent cx="5943600" cy="19050"/>
                 <wp:effectExtent l="0" t="0" r="0" b="0"/>
-                <wp:docPr id="1" name=""/>
+                <wp:docPr id="1" name="Shape1"/>
                 <a:graphic xmlns:a="http://schemas.openxmlformats.org/drawingml/2006/main">
                   <a:graphicData uri="http://schemas.microsoft.com/office/word/2010/wordprocessingShape">
                     <wps:wsp>
                       <wps:cNvSpPr/>
-                      <wps:nvSpPr>
-                        <wps:cNvPr id="2" name=""/>
-                        <wps:cNvSpPr/>
-                      </wps:nvSpPr>
                       <wps:spPr>
                         <a:xfrm>
                           <a:off x="0" y="0"/>
@@ -109,6 +95,12 @@
                           <a:noFill/>
                         </a:ln>
                       </wps:spPr>
+                      <wps:style>
+                        <a:lnRef idx="0"/>
+                        <a:fillRef idx="0"/>
+                        <a:effectRef idx="0"/>
+                        <a:fontRef idx="minor"/>
+                      </wps:style>
                       <wps:bodyPr/>
                     </wps:wsp>
                   </a:graphicData>
@@ -121,10 +113,10 @@
           </mc:Choice>
           <mc:Fallback>
             <w:pict>
-              <v:rect id="shape_0" fillcolor="#a0a0a0" stroked="f" o:allowincell="f" style="position:absolute;margin-left:0pt;margin-top:-1.55pt;width:467.95pt;height:1.45pt;mso-wrap-style:none;v-text-anchor:middle;mso-position-horizontal:center;mso-position-vertical:top">
+              <v:rect id="shape_0" fillcolor="#a0a0a0" stroked="f" o:allowincell="f" style="position:absolute;margin-left:0pt;margin-top:-1.55pt;width:467.95pt;height:1.45pt;mso-wrap-style:none;v-text-anchor:middle;mso-position-vertical:top">
                 <v:fill o:detectmouseclick="t" type="solid" color2="#5f5f5f"/>
                 <v:stroke color="#3465a4" joinstyle="round" endcap="flat"/>
-                <w10:wrap type="topAndBottom"/>
+                <w10:wrap type="square"/>
               </v:rect>
             </w:pict>
           </mc:Fallback>
@@ -268,15 +260,11 @@
               <wp:inline distT="0" distB="0" distL="0" distR="0">
                 <wp:extent cx="5943600" cy="19050"/>
                 <wp:effectExtent l="0" t="0" r="0" b="0"/>
-                <wp:docPr id="3" name=""/>
+                <wp:docPr id="2" name="Shape2"/>
                 <a:graphic xmlns:a="http://schemas.openxmlformats.org/drawingml/2006/main">
                   <a:graphicData uri="http://schemas.microsoft.com/office/word/2010/wordprocessingShape">
                     <wps:wsp>
                       <wps:cNvSpPr/>
-                      <wps:nvSpPr>
-                        <wps:cNvPr id="4" name=""/>
-                        <wps:cNvSpPr/>
-                      </wps:nvSpPr>
                       <wps:spPr>
                         <a:xfrm>
                           <a:off x="0" y="0"/>
@@ -292,6 +280,12 @@
                           <a:noFill/>
                         </a:ln>
                       </wps:spPr>
+                      <wps:style>
+                        <a:lnRef idx="0"/>
+                        <a:fillRef idx="0"/>
+                        <a:effectRef idx="0"/>
+                        <a:fontRef idx="minor"/>
+                      </wps:style>
                       <wps:bodyPr/>
                     </wps:wsp>
                   </a:graphicData>
@@ -304,10 +298,10 @@
           </mc:Choice>
           <mc:Fallback>
             <w:pict>
-              <v:rect id="shape_0" fillcolor="#a0a0a0" stroked="f" o:allowincell="f" style="position:absolute;margin-left:0pt;margin-top:-1.55pt;width:467.95pt;height:1.45pt;mso-wrap-style:none;v-text-anchor:middle;mso-position-horizontal:center;mso-position-vertical:top">
+              <v:rect id="shape_0" fillcolor="#a0a0a0" stroked="f" o:allowincell="f" style="position:absolute;margin-left:0pt;margin-top:-1.55pt;width:467.95pt;height:1.45pt;mso-wrap-style:none;v-text-anchor:middle;mso-position-vertical:top">
                 <v:fill o:detectmouseclick="t" type="solid" color2="#5f5f5f"/>
                 <v:stroke color="#3465a4" joinstyle="round" endcap="flat"/>
-                <w10:wrap type="topAndBottom"/>
+                <w10:wrap type="square"/>
               </v:rect>
             </w:pict>
           </mc:Fallback>
@@ -435,15 +429,11 @@
               <wp:inline distT="0" distB="0" distL="0" distR="0">
                 <wp:extent cx="5943600" cy="19050"/>
                 <wp:effectExtent l="0" t="0" r="0" b="0"/>
-                <wp:docPr id="5" name=""/>
+                <wp:docPr id="3" name="Shape3"/>
                 <a:graphic xmlns:a="http://schemas.openxmlformats.org/drawingml/2006/main">
                   <a:graphicData uri="http://schemas.microsoft.com/office/word/2010/wordprocessingShape">
                     <wps:wsp>
                       <wps:cNvSpPr/>
-                      <wps:nvSpPr>
-                        <wps:cNvPr id="6" name=""/>
-                        <wps:cNvSpPr/>
-                      </wps:nvSpPr>
                       <wps:spPr>
                         <a:xfrm>
                           <a:off x="0" y="0"/>
@@ -459,6 +449,12 @@
                           <a:noFill/>
                         </a:ln>
                       </wps:spPr>
+                      <wps:style>
+                        <a:lnRef idx="0"/>
+                        <a:fillRef idx="0"/>
+                        <a:effectRef idx="0"/>
+                        <a:fontRef idx="minor"/>
+                      </wps:style>
                       <wps:bodyPr/>
                     </wps:wsp>
                   </a:graphicData>
@@ -471,10 +467,10 @@
           </mc:Choice>
           <mc:Fallback>
             <w:pict>
-              <v:rect id="shape_0" fillcolor="#a0a0a0" stroked="f" o:allowincell="f" style="position:absolute;margin-left:0pt;margin-top:-1.55pt;width:467.95pt;height:1.45pt;mso-wrap-style:none;v-text-anchor:middle;mso-position-horizontal:center;mso-position-vertical:top">
+              <v:rect id="shape_0" fillcolor="#a0a0a0" stroked="f" o:allowincell="f" style="position:absolute;margin-left:0pt;margin-top:-1.55pt;width:467.95pt;height:1.45pt;mso-wrap-style:none;v-text-anchor:middle;mso-position-vertical:top">
                 <v:fill o:detectmouseclick="t" type="solid" color2="#5f5f5f"/>
                 <v:stroke color="#3465a4" joinstyle="round" endcap="flat"/>
-                <w10:wrap type="topAndBottom"/>
+                <w10:wrap type="square"/>
               </v:rect>
             </w:pict>
           </mc:Fallback>
@@ -607,15 +603,11 @@
               <wp:inline distT="0" distB="0" distL="0" distR="0">
                 <wp:extent cx="5943600" cy="19050"/>
                 <wp:effectExtent l="0" t="0" r="0" b="0"/>
-                <wp:docPr id="7" name=""/>
+                <wp:docPr id="4" name="Shape4"/>
                 <a:graphic xmlns:a="http://schemas.openxmlformats.org/drawingml/2006/main">
                   <a:graphicData uri="http://schemas.microsoft.com/office/word/2010/wordprocessingShape">
                     <wps:wsp>
                       <wps:cNvSpPr/>
-                      <wps:nvSpPr>
-                        <wps:cNvPr id="8" name=""/>
-                        <wps:cNvSpPr/>
-                      </wps:nvSpPr>
                       <wps:spPr>
                         <a:xfrm>
                           <a:off x="0" y="0"/>
@@ -631,6 +623,12 @@
                           <a:noFill/>
                         </a:ln>
                       </wps:spPr>
+                      <wps:style>
+                        <a:lnRef idx="0"/>
+                        <a:fillRef idx="0"/>
+                        <a:effectRef idx="0"/>
+                        <a:fontRef idx="minor"/>
+                      </wps:style>
                       <wps:bodyPr/>
                     </wps:wsp>
                   </a:graphicData>
@@ -643,10 +641,10 @@
           </mc:Choice>
           <mc:Fallback>
             <w:pict>
-              <v:rect id="shape_0" fillcolor="#a0a0a0" stroked="f" o:allowincell="f" style="position:absolute;margin-left:0pt;margin-top:-1.55pt;width:467.95pt;height:1.45pt;mso-wrap-style:none;v-text-anchor:middle;mso-position-horizontal:center;mso-position-vertical:top">
+              <v:rect id="shape_0" fillcolor="#a0a0a0" stroked="f" o:allowincell="f" style="position:absolute;margin-left:0pt;margin-top:-1.55pt;width:467.95pt;height:1.45pt;mso-wrap-style:none;v-text-anchor:middle;mso-position-vertical:top">
                 <v:fill o:detectmouseclick="t" type="solid" color2="#5f5f5f"/>
                 <v:stroke color="#3465a4" joinstyle="round" endcap="flat"/>
-                <w10:wrap type="topAndBottom"/>
+                <w10:wrap type="square"/>
               </v:rect>
             </w:pict>
           </mc:Fallback>
@@ -811,15 +809,11 @@
               <wp:inline distT="0" distB="0" distL="0" distR="0">
                 <wp:extent cx="5943600" cy="19050"/>
                 <wp:effectExtent l="0" t="0" r="0" b="0"/>
-                <wp:docPr id="9" name=""/>
+                <wp:docPr id="5" name="Shape5"/>
                 <a:graphic xmlns:a="http://schemas.openxmlformats.org/drawingml/2006/main">
                   <a:graphicData uri="http://schemas.microsoft.com/office/word/2010/wordprocessingShape">
                     <wps:wsp>
                       <wps:cNvSpPr/>
-                      <wps:nvSpPr>
-                        <wps:cNvPr id="10" name=""/>
-                        <wps:cNvSpPr/>
-                      </wps:nvSpPr>
                       <wps:spPr>
                         <a:xfrm>
                           <a:off x="0" y="0"/>
@@ -835,6 +829,12 @@
                           <a:noFill/>
                         </a:ln>
                       </wps:spPr>
+                      <wps:style>
+                        <a:lnRef idx="0"/>
+                        <a:fillRef idx="0"/>
+                        <a:effectRef idx="0"/>
+                        <a:fontRef idx="minor"/>
+                      </wps:style>
                       <wps:bodyPr/>
                     </wps:wsp>
                   </a:graphicData>
@@ -847,10 +847,10 @@
           </mc:Choice>
           <mc:Fallback>
             <w:pict>
-              <v:rect id="shape_0" fillcolor="#a0a0a0" stroked="f" o:allowincell="f" style="position:absolute;margin-left:0pt;margin-top:-1.55pt;width:467.95pt;height:1.45pt;mso-wrap-style:none;v-text-anchor:middle;mso-position-horizontal:center;mso-position-vertical:top">
+              <v:rect id="shape_0" fillcolor="#a0a0a0" stroked="f" o:allowincell="f" style="position:absolute;margin-left:0pt;margin-top:-1.55pt;width:467.95pt;height:1.45pt;mso-wrap-style:none;v-text-anchor:middle;mso-position-vertical:top">
                 <v:fill o:detectmouseclick="t" type="solid" color2="#5f5f5f"/>
                 <v:stroke color="#3465a4" joinstyle="round" endcap="flat"/>
-                <w10:wrap type="topAndBottom"/>
+                <w10:wrap type="square"/>
               </v:rect>
             </w:pict>
           </mc:Fallback>
@@ -994,15 +994,11 @@
               <wp:inline distT="0" distB="0" distL="0" distR="0">
                 <wp:extent cx="5943600" cy="19050"/>
                 <wp:effectExtent l="0" t="0" r="0" b="0"/>
-                <wp:docPr id="11" name=""/>
+                <wp:docPr id="6" name="Shape6"/>
                 <a:graphic xmlns:a="http://schemas.openxmlformats.org/drawingml/2006/main">
                   <a:graphicData uri="http://schemas.microsoft.com/office/word/2010/wordprocessingShape">
                     <wps:wsp>
                       <wps:cNvSpPr/>
-                      <wps:nvSpPr>
-                        <wps:cNvPr id="12" name=""/>
-                        <wps:cNvSpPr/>
-                      </wps:nvSpPr>
                       <wps:spPr>
                         <a:xfrm>
                           <a:off x="0" y="0"/>
@@ -1018,6 +1014,12 @@
                           <a:noFill/>
                         </a:ln>
                       </wps:spPr>
+                      <wps:style>
+                        <a:lnRef idx="0"/>
+                        <a:fillRef idx="0"/>
+                        <a:effectRef idx="0"/>
+                        <a:fontRef idx="minor"/>
+                      </wps:style>
                       <wps:bodyPr/>
                     </wps:wsp>
                   </a:graphicData>
@@ -1030,10 +1032,10 @@
           </mc:Choice>
           <mc:Fallback>
             <w:pict>
-              <v:rect id="shape_0" fillcolor="#a0a0a0" stroked="f" o:allowincell="f" style="position:absolute;margin-left:0pt;margin-top:-1.55pt;width:467.95pt;height:1.45pt;mso-wrap-style:none;v-text-anchor:middle;mso-position-horizontal:center;mso-position-vertical:top">
+              <v:rect id="shape_0" fillcolor="#a0a0a0" stroked="f" o:allowincell="f" style="position:absolute;margin-left:0pt;margin-top:-1.55pt;width:467.95pt;height:1.45pt;mso-wrap-style:none;v-text-anchor:middle;mso-position-vertical:top">
                 <v:fill o:detectmouseclick="t" type="solid" color2="#5f5f5f"/>
                 <v:stroke color="#3465a4" joinstyle="round" endcap="flat"/>
-                <w10:wrap type="topAndBottom"/>
+                <w10:wrap type="square"/>
               </v:rect>
             </w:pict>
           </mc:Fallback>
@@ -1169,15 +1171,11 @@
               <wp:inline distT="0" distB="0" distL="0" distR="0">
                 <wp:extent cx="5943600" cy="19050"/>
                 <wp:effectExtent l="0" t="0" r="0" b="0"/>
-                <wp:docPr id="13" name=""/>
+                <wp:docPr id="7" name="Shape7"/>
                 <a:graphic xmlns:a="http://schemas.openxmlformats.org/drawingml/2006/main">
                   <a:graphicData uri="http://schemas.microsoft.com/office/word/2010/wordprocessingShape">
                     <wps:wsp>
                       <wps:cNvSpPr/>
-                      <wps:nvSpPr>
-                        <wps:cNvPr id="14" name=""/>
-                        <wps:cNvSpPr/>
-                      </wps:nvSpPr>
                       <wps:spPr>
                         <a:xfrm>
                           <a:off x="0" y="0"/>
@@ -1193,6 +1191,12 @@
                           <a:noFill/>
                         </a:ln>
                       </wps:spPr>
+                      <wps:style>
+                        <a:lnRef idx="0"/>
+                        <a:fillRef idx="0"/>
+                        <a:effectRef idx="0"/>
+                        <a:fontRef idx="minor"/>
+                      </wps:style>
                       <wps:bodyPr/>
                     </wps:wsp>
                   </a:graphicData>
@@ -1205,10 +1209,10 @@
           </mc:Choice>
           <mc:Fallback>
             <w:pict>
-              <v:rect id="shape_0" fillcolor="#a0a0a0" stroked="f" o:allowincell="f" style="position:absolute;margin-left:0pt;margin-top:-1.55pt;width:467.95pt;height:1.45pt;mso-wrap-style:none;v-text-anchor:middle;mso-position-horizontal:center;mso-position-vertical:top">
+              <v:rect id="shape_0" fillcolor="#a0a0a0" stroked="f" o:allowincell="f" style="position:absolute;margin-left:0pt;margin-top:-1.55pt;width:467.95pt;height:1.45pt;mso-wrap-style:none;v-text-anchor:middle;mso-position-vertical:top">
                 <v:fill o:detectmouseclick="t" type="solid" color2="#5f5f5f"/>
                 <v:stroke color="#3465a4" joinstyle="round" endcap="flat"/>
-                <w10:wrap type="topAndBottom"/>
+                <w10:wrap type="square"/>
               </v:rect>
             </w:pict>
           </mc:Fallback>
@@ -2329,6 +2333,7 @@
     <w:qFormat/>
     <w:pPr>
       <w:widowControl/>
+      <w:suppressAutoHyphens w:val="true"/>
       <w:bidi w:val="0"/>
       <w:spacing w:lineRule="auto" w:line="276" w:before="0" w:after="0"/>
       <w:jc w:val="start"/>
@@ -2511,6 +2516,7 @@
     <w:qFormat/>
     <w:pPr>
       <w:widowControl/>
+      <w:suppressAutoHyphens w:val="true"/>
       <w:bidi w:val="0"/>
       <w:spacing w:lineRule="auto" w:line="276" w:before="0" w:after="0"/>
       <w:jc w:val="start"/>

</xml_diff>